<commit_message>
Add OpenAlex reference verification report and details
</commit_message>
<xml_diff>
--- a/papers/文本表征的价值观_定稿.docx
+++ b/papers/文本表征的价值观_定稿.docx
@@ -372,6 +372,42 @@
         <w:t xml:space="preserve">[13]</w:t>
       </w:r>
       <w:r>
+        <w:t xml:space="preserve">）；这一批评近年被进一步推至测量工具本身——心理量表及其常模样本同样高度偏向西方人群，所谓“人类”基准实为地方性基准（Atari </w:t>
+      </w:r>
+      <w:r>
+        <w:rPr>
+          <w:rStyle w:val="XT外文斜体"/>
+        </w:rPr>
+        <w:t xml:space="preserve">et al.</w:t>
+      </w:r>
+      <w:r>
+        <w:t xml:space="preserve">, 2023</w:t>
+      </w:r>
+      <w:r>
+        <w:rPr>
+          <w:rStyle w:val="XT引文编号"/>
+        </w:rPr>
+        <w:t xml:space="preserve">[57]</w:t>
+      </w:r>
+      <w:r>
+        <w:t xml:space="preserve">），而将心理测量量表直接用于锚定文本分析、以构念而非派生词表为测量起点，正成为文本测量方法学的新方向（Atari </w:t>
+      </w:r>
+      <w:r>
+        <w:rPr>
+          <w:rStyle w:val="XT外文斜体"/>
+        </w:rPr>
+        <w:t xml:space="preserve">et al.</w:t>
+      </w:r>
+      <w:r>
+        <w:t xml:space="preserve">, 2023</w:t>
+      </w:r>
+      <w:r>
+        <w:rPr>
+          <w:rStyle w:val="XT引文编号"/>
+        </w:rPr>
+        <w:t xml:space="preserve">[58]</w:t>
+      </w:r>
+      <w:r>
         <w:t xml:space="preserve">）。在新闻与传播领域，Hanitzsch </w:t>
       </w:r>
       <w:r>
@@ -1071,7 +1107,7 @@
         <w:t xml:space="preserve">[54]</w:t>
       </w:r>
       <w:r>
-        <w:t xml:space="preserve">据此主张以叙事任务替代问卷施测。这些争论与我们测度文本价值观时面临的“封闭式词表 vs 操作化定义”问题在结构上高度同构。此外，以 LLM 模拟人群被试的做法被证明会对身份群体造成扁平化与误表征（Wang </w:t>
+        <w:t xml:space="preserve">据此主张以叙事任务替代问卷施测；Pawar </w:t>
       </w:r>
       <w:r>
         <w:rPr>
@@ -1080,6 +1116,24 @@
         <w:t xml:space="preserve">et al.</w:t>
       </w:r>
       <w:r>
+        <w:t xml:space="preserve">（2025）</w:t>
+      </w:r>
+      <w:r>
+        <w:rPr>
+          <w:rStyle w:val="XT引文编号"/>
+        </w:rPr>
+        <w:t xml:space="preserve">[59]</w:t>
+      </w:r>
+      <w:r>
+        <w:t xml:space="preserve">则将语言模型的文化意识评估从纯文本扩展至多模态。这些争论与我们测度文本价值观时面临的“封闭式词表 vs 操作化定义”问题在结构上高度同构。此外，以 LLM 模拟人群被试的做法被证明会对身份群体造成扁平化与误表征（Wang </w:t>
+      </w:r>
+      <w:r>
+        <w:rPr>
+          <w:rStyle w:val="XT外文斜体"/>
+        </w:rPr>
+        <w:t xml:space="preserve">et al.</w:t>
+      </w:r>
+      <w:r>
         <w:t xml:space="preserve">, 2025</w:t>
       </w:r>
       <w:r>
@@ -1107,7 +1161,25 @@
         <w:t xml:space="preserve">[56]</w:t>
       </w:r>
       <w:r>
-        <w:t xml:space="preserve">则探讨了以价值观调查数据校准对话代理的可行性——它们共同提示：任何以模型为中介的文化测量都必须同时证明其测量本身可靠。</w:t>
+        <w:t xml:space="preserve">则探讨了以价值观调查数据校准对话代理的可行性——它们共同提示：任何以模型为中介的文化测量都必须同时证明其测量本身可靠。传播学方法研究近年已明确主张，语言模型必须针对其所声称测量的构念进行效度检验，且提示词设计会同时改变效度与偏置（Laurer </w:t>
+      </w:r>
+      <w:r>
+        <w:rPr>
+          <w:rStyle w:val="XT外文斜体"/>
+        </w:rPr>
+        <w:t xml:space="preserve">et al.</w:t>
+      </w:r>
+      <w:r>
+        <w:t xml:space="preserve">, 2024</w:t>
+      </w:r>
+      <w:r>
+        <w:rPr>
+          <w:rStyle w:val="XT引文编号"/>
+        </w:rPr>
+        <w:t xml:space="preserve">[60]</w:t>
+      </w:r>
+      <w:r>
+        <w:t xml:space="preserve">）——这与本文的测量效度框架直接呼应。</w:t>
       </w:r>
     </w:p>
     <w:p>
@@ -14958,6 +15030,74 @@
       </w:r>
       <w:r>
         <w:t xml:space="preserve"> (pp. 929–945). https://doi.org/10.18653/v1/2024.findings-eacl.63</w:t>
+      </w:r>
+    </w:p>
+    <w:p>
+      <w:pPr>
+        <w:pStyle w:val="XT参考文献"/>
+      </w:pPr>
+      <w:r>
+        <w:t xml:space="preserve">[57] Atari, M., Xue, M. J., Park, P. S., Blasi, D. E., &amp; Henrich, J. (2023). Which humans? </w:t>
+      </w:r>
+      <w:r>
+        <w:rPr>
+          <w:rStyle w:val="XT外文斜体"/>
+        </w:rPr>
+        <w:t xml:space="preserve">PsyArXiv</w:t>
+      </w:r>
+      <w:r>
+        <w:t xml:space="preserve">. https://doi.org/10.31234/osf.io/5b26t</w:t>
+      </w:r>
+    </w:p>
+    <w:p>
+      <w:pPr>
+        <w:pStyle w:val="XT参考文献"/>
+      </w:pPr>
+      <w:r>
+        <w:t xml:space="preserve">[58] Atari, M., Omrani, A., &amp; Dehghani, M. (2023). Contextualized construct representation: Leveraging psychometric scales to advance theory-driven text analysis. </w:t>
+      </w:r>
+      <w:r>
+        <w:rPr>
+          <w:rStyle w:val="XT外文斜体"/>
+        </w:rPr>
+        <w:t xml:space="preserve">PsyArXiv</w:t>
+      </w:r>
+      <w:r>
+        <w:t xml:space="preserve">. https://doi.org/10.31234/osf.io/m93pd</w:t>
+      </w:r>
+    </w:p>
+    <w:p>
+      <w:pPr>
+        <w:pStyle w:val="XT参考文献"/>
+      </w:pPr>
+      <w:r>
+        <w:t xml:space="preserve">[59] Pawar, S., Park, J., Jin, J., &amp; Arora, A. (2025). Survey of cultural awareness in language models: Text and beyond. </w:t>
+      </w:r>
+      <w:r>
+        <w:rPr>
+          <w:rStyle w:val="XT外文斜体"/>
+        </w:rPr>
+        <w:t xml:space="preserve">Computational Linguistics</w:t>
+      </w:r>
+      <w:r>
+        <w:t xml:space="preserve">. https://doi.org/10.1162/coli.a.14</w:t>
+      </w:r>
+    </w:p>
+    <w:p>
+      <w:pPr>
+        <w:pStyle w:val="XT参考文献"/>
+      </w:pPr>
+      <w:r>
+        <w:t xml:space="preserve">[60] Laurer, M., van Atteveldt, W., Casas, A., &amp; Welbers, K. (2024). On measurement validity and language models: Increasing validity and decreasing bias with instructions. </w:t>
+      </w:r>
+      <w:r>
+        <w:rPr>
+          <w:rStyle w:val="XT外文斜体"/>
+        </w:rPr>
+        <w:t xml:space="preserve">Communication Methods and Measures</w:t>
+      </w:r>
+      <w:r>
+        <w:t xml:space="preserve">. https://doi.org/10.1080/19312458.2024.2378690</w:t>
       </w:r>
     </w:p>
     <w:sectPr>

</xml_diff>